<commit_message>
docs: Ajustar planes cloud y sector público (solución completa)
</commit_message>
<xml_diff>
--- a/docs/comercial/PRECIOS_INTERNO_CODEFLOWX_NOV2025.docx
+++ b/docs/comercial/PRECIOS_INTERNO_CODEFLOWX_NOV2025.docx
@@ -199,13 +199,13 @@
       </w:r>
     </w:p>
     <w:bookmarkEnd w:id="21"/>
-    <w:bookmarkStart w:id="22" w:name="Xe5d60101e1bdde056fec95bd18f0a993979215f"/>
+    <w:bookmarkStart w:id="22" w:name="cloud-saas-gestionado-por-codeflowx"/>
     <w:p>
       <w:pPr>
         <w:pStyle w:val="Heading2"/>
       </w:pPr>
       <w:r>
-        <w:t xml:space="preserve">🟢 CLOUD COMPLIANCE (SaaS gestionado CodeflowX)</w:t>
+        <w:t xml:space="preserve">🟢 CLOUD (SaaS gestionado por CodeflowX)</w:t>
       </w:r>
     </w:p>
     <w:tbl>
@@ -216,12 +216,12 @@
         <w:jc w:val="start"/>
       </w:tblPr>
       <w:tblGrid>
-        <w:gridCol w:w="533"/>
-        <w:gridCol w:w="1601"/>
-        <w:gridCol w:w="1690"/>
-        <w:gridCol w:w="1245"/>
-        <w:gridCol w:w="711"/>
-        <w:gridCol w:w="2135"/>
+        <w:gridCol w:w="617"/>
+        <w:gridCol w:w="1851"/>
+        <w:gridCol w:w="1954"/>
+        <w:gridCol w:w="1440"/>
+        <w:gridCol w:w="925"/>
+        <w:gridCol w:w="1131"/>
       </w:tblGrid>
       <w:tr>
         <w:trPr>
@@ -283,19 +283,19 @@
               <w:jc w:val="left"/>
             </w:pPr>
             <w:r>
-              <w:t xml:space="preserve">Target</w:t>
-            </w:r>
-          </w:p>
-        </w:tc>
-        <w:tc>
-          <w:tcPr/>
-          <w:p>
-            <w:pPr>
-              <w:pStyle w:val="Compact"/>
-              <w:jc w:val="left"/>
-            </w:pPr>
-            <w:r>
-              <w:t xml:space="preserve">Características clave</w:t>
+              <w:t xml:space="preserve">Enfoque</w:t>
+            </w:r>
+          </w:p>
+        </w:tc>
+        <w:tc>
+          <w:tcPr/>
+          <w:p>
+            <w:pPr>
+              <w:pStyle w:val="Compact"/>
+              <w:jc w:val="left"/>
+            </w:pPr>
+            <w:r>
+              <w:t xml:space="preserve">Cobertura</w:t>
             </w:r>
           </w:p>
         </w:tc>
@@ -313,7 +313,7 @@
                 <w:bCs/>
                 <w:b/>
               </w:rPr>
-              <w:t xml:space="preserve">Cloud Basic</w:t>
+              <w:t xml:space="preserve">Cloud Compliance (Basic)</w:t>
             </w:r>
           </w:p>
         </w:tc>
@@ -365,37 +365,63 @@
               <w:jc w:val="left"/>
             </w:pPr>
             <w:r>
-              <w:t xml:space="preserve">Desarrolladores individuales, microagencias (≤10 personas)</w:t>
-            </w:r>
-          </w:p>
-        </w:tc>
-        <w:tc>
-          <w:tcPr/>
-          <w:p>
-            <w:pPr>
-              <w:pStyle w:val="Compact"/>
-              <w:jc w:val="left"/>
-            </w:pPr>
-            <w:r>
-              <w:t xml:space="preserve">1 sistema IA alto riesgo o 3 riesgo limitado, 100k tokens/mes, 2 usuarios, soporte email 48h, reporting mensual compliance básico</w:t>
-            </w:r>
-          </w:p>
-        </w:tc>
-      </w:tr>
-      <w:tr>
-        <w:tc>
-          <w:tcPr/>
-          <w:p>
-            <w:pPr>
-              <w:pStyle w:val="Compact"/>
-              <w:jc w:val="left"/>
-            </w:pPr>
+              <w:t xml:space="preserve">Freelance, microagencias (≤10 personas) que necesitan</w:t>
+            </w:r>
+            <w:r>
+              <w:t xml:space="preserve"> </w:t>
+            </w:r>
             <w:r>
               <w:rPr>
                 <w:bCs/>
                 <w:b/>
               </w:rPr>
-              <w:t xml:space="preserve">Cloud Professional</w:t>
+              <w:t xml:space="preserve">cumplimiento esencial</w:t>
+            </w:r>
+          </w:p>
+        </w:tc>
+        <w:tc>
+          <w:tcPr/>
+          <w:p>
+            <w:pPr>
+              <w:pStyle w:val="Compact"/>
+              <w:jc w:val="left"/>
+            </w:pPr>
+            <w:r>
+              <w:t xml:space="preserve">Hasta</w:t>
+            </w:r>
+            <w:r>
+              <w:t xml:space="preserve"> </w:t>
+            </w:r>
+            <w:r>
+              <w:rPr>
+                <w:bCs/>
+                <w:b/>
+              </w:rPr>
+              <w:t xml:space="preserve">2 sistemas IA</w:t>
+            </w:r>
+            <w:r>
+              <w:t xml:space="preserve"> </w:t>
+            </w:r>
+            <w:r>
+              <w:t xml:space="preserve">(chatbots/agentes/RAG), checklists Art. 9-15, documentación Anexo IV básica, políticas Art. 50, FRIA templates, 2 usuarios, soporte email 48h</w:t>
+            </w:r>
+          </w:p>
+        </w:tc>
+      </w:tr>
+      <w:tr>
+        <w:tc>
+          <w:tcPr/>
+          <w:p>
+            <w:pPr>
+              <w:pStyle w:val="Compact"/>
+              <w:jc w:val="left"/>
+            </w:pPr>
+            <w:r>
+              <w:rPr>
+                <w:bCs/>
+                <w:b/>
+              </w:rPr>
+              <w:t xml:space="preserve">Cloud Governance (Professional)</w:t>
             </w:r>
           </w:p>
         </w:tc>
@@ -447,37 +473,60 @@
               <w:jc w:val="left"/>
             </w:pPr>
             <w:r>
-              <w:t xml:space="preserve">Agencias/consultoras 10-50 personas, software factories</w:t>
-            </w:r>
-          </w:p>
-        </w:tc>
-        <w:tc>
-          <w:tcPr/>
-          <w:p>
-            <w:pPr>
-              <w:pStyle w:val="Compact"/>
-              <w:jc w:val="left"/>
-            </w:pPr>
-            <w:r>
-              <w:t xml:space="preserve">Hasta 5 sistemas IA, 500k tokens/mes, 10 usuarios, workflows personalizados, alertas desviaciones, soporte prioritario (12h), documentación Anexo IV automatizada</w:t>
-            </w:r>
-          </w:p>
-        </w:tc>
-      </w:tr>
-      <w:tr>
-        <w:tc>
-          <w:tcPr/>
-          <w:p>
-            <w:pPr>
-              <w:pStyle w:val="Compact"/>
-              <w:jc w:val="left"/>
-            </w:pPr>
+              <w:t xml:space="preserve">Agencias/consultoras 10-50 personas y software factories que necesitan</w:t>
+            </w:r>
+            <w:r>
+              <w:t xml:space="preserve"> </w:t>
+            </w:r>
             <w:r>
               <w:rPr>
                 <w:bCs/>
                 <w:b/>
               </w:rPr>
-              <w:t xml:space="preserve">Cloud OEM (White Label)</w:t>
+              <w:t xml:space="preserve">gobierno completo</w:t>
+            </w:r>
+          </w:p>
+        </w:tc>
+        <w:tc>
+          <w:tcPr/>
+          <w:p>
+            <w:pPr>
+              <w:pStyle w:val="Compact"/>
+              <w:jc w:val="left"/>
+            </w:pPr>
+            <w:r>
+              <w:t xml:space="preserve">Hasta</w:t>
+            </w:r>
+            <w:r>
+              <w:t xml:space="preserve"> </w:t>
+            </w:r>
+            <w:r>
+              <w:rPr>
+                <w:bCs/>
+                <w:b/>
+              </w:rPr>
+              <w:t xml:space="preserve">7 sistemas IA</w:t>
+            </w:r>
+            <w:r>
+              <w:t xml:space="preserve">, workflows BPMN, evaluación métricas, monitorización 24/7, alertas desviaciones, reporting Art. 71, 12 usuarios, soporte prioritario 12h</w:t>
+            </w:r>
+          </w:p>
+        </w:tc>
+      </w:tr>
+      <w:tr>
+        <w:tc>
+          <w:tcPr/>
+          <w:p>
+            <w:pPr>
+              <w:pStyle w:val="Compact"/>
+              <w:jc w:val="left"/>
+            </w:pPr>
+            <w:r>
+              <w:rPr>
+                <w:bCs/>
+                <w:b/>
+              </w:rPr>
+              <w:t xml:space="preserve">Cloud Enterprise</w:t>
             </w:r>
           </w:p>
         </w:tc>
@@ -495,59 +544,69 @@
               </w:rPr>
               <w:t xml:space="preserve">799 €</w:t>
             </w:r>
+          </w:p>
+        </w:tc>
+        <w:tc>
+          <w:tcPr/>
+          <w:p>
+            <w:pPr>
+              <w:pStyle w:val="Compact"/>
+              <w:jc w:val="left"/>
+            </w:pPr>
+            <w:r>
+              <w:t xml:space="preserve">105 € (3 instancias)</w:t>
+            </w:r>
+          </w:p>
+        </w:tc>
+        <w:tc>
+          <w:tcPr/>
+          <w:p>
+            <w:pPr>
+              <w:pStyle w:val="Compact"/>
+              <w:jc w:val="left"/>
+            </w:pPr>
+            <w:r>
+              <w:t xml:space="preserve">87%</w:t>
+            </w:r>
+          </w:p>
+        </w:tc>
+        <w:tc>
+          <w:tcPr/>
+          <w:p>
+            <w:pPr>
+              <w:pStyle w:val="Compact"/>
+              <w:jc w:val="left"/>
+            </w:pPr>
+            <w:r>
+              <w:t xml:space="preserve">Partners SaaS y organizaciones con múltiples clientes internos. Incluye</w:t>
+            </w:r>
             <w:r>
               <w:t xml:space="preserve"> </w:t>
             </w:r>
             <w:r>
-              <w:t xml:space="preserve">+ 0,09 €/query IA</w:t>
-            </w:r>
-          </w:p>
-        </w:tc>
-        <w:tc>
-          <w:tcPr/>
-          <w:p>
-            <w:pPr>
-              <w:pStyle w:val="Compact"/>
-              <w:jc w:val="left"/>
-            </w:pPr>
-            <w:r>
-              <w:t xml:space="preserve">105 € (3 instancias)</w:t>
-            </w:r>
-          </w:p>
-        </w:tc>
-        <w:tc>
-          <w:tcPr/>
-          <w:p>
-            <w:pPr>
-              <w:pStyle w:val="Compact"/>
-              <w:jc w:val="left"/>
-            </w:pPr>
-            <w:r>
-              <w:t xml:space="preserve">87%</w:t>
-            </w:r>
-          </w:p>
-        </w:tc>
-        <w:tc>
-          <w:tcPr/>
-          <w:p>
-            <w:pPr>
-              <w:pStyle w:val="Compact"/>
-              <w:jc w:val="left"/>
-            </w:pPr>
-            <w:r>
-              <w:t xml:space="preserve">Partners que empaquetan CodeflowX en su oferta SaaS</w:t>
-            </w:r>
-          </w:p>
-        </w:tc>
-        <w:tc>
-          <w:tcPr/>
-          <w:p>
-            <w:pPr>
-              <w:pStyle w:val="Compact"/>
-              <w:jc w:val="left"/>
-            </w:pPr>
-            <w:r>
-              <w:t xml:space="preserve">Marca blanca completa, API multi-tenant, límites configurables, SLA 99,5%, soporte 4h, formación comercial, facturación uso (queries, almacenamiento)</w:t>
+              <w:rPr>
+                <w:bCs/>
+                <w:b/>
+              </w:rPr>
+              <w:t xml:space="preserve">solución completa</w:t>
+            </w:r>
+            <w:r>
+              <w:t xml:space="preserve"> </w:t>
+            </w:r>
+            <w:r>
+              <w:t xml:space="preserve">(cumplimiento + gobierno + evaluación + monitorización) multi-tenant</w:t>
+            </w:r>
+          </w:p>
+        </w:tc>
+        <w:tc>
+          <w:tcPr/>
+          <w:p>
+            <w:pPr>
+              <w:pStyle w:val="Compact"/>
+              <w:jc w:val="left"/>
+            </w:pPr>
+            <w:r>
+              <w:t xml:space="preserve">Multi-tenant, marca blanca opcional, API configurables, dashboards agregados, SLA 99,5 %, soporte 4h, formación comercial, controles centralizados</w:t>
             </w:r>
           </w:p>
         </w:tc>
@@ -568,25 +627,25 @@
         <w:t xml:space="preserve"> </w:t>
       </w:r>
       <w:r>
-        <w:t xml:space="preserve">- Facturación mensual (pago anual anticipado: descuento 10%)</w:t>
+        <w:t xml:space="preserve">- Precios sin inferencia incluida. CodeflowX se integra con la infraestructura de modelos existente del cliente. Se ofrece un módulo opcional de servidores de inferencia (ver add-ons).</w:t>
       </w:r>
       <w:r>
         <w:t xml:space="preserve"> </w:t>
       </w:r>
       <w:r>
-        <w:t xml:space="preserve">- Onboarding opcional (ver tabla add-ons)</w:t>
+        <w:t xml:space="preserve">- Facturación mensual; pago anual anticipado (‑10 %).</w:t>
       </w:r>
       <w:r>
         <w:t xml:space="preserve"> </w:t>
       </w:r>
       <w:r>
-        <w:t xml:space="preserve">- Exceso tokens/consultas: 0,015 € por 1.000 tokens o 0,05 € por consulta IA</w:t>
+        <w:t xml:space="preserve">- Número de sistemas IA = combinaciones de chatbots, agentes, RAG, scoring u otros flows gobernados. Packs adicionales disponibles.</w:t>
       </w:r>
       <w:r>
         <w:t xml:space="preserve"> </w:t>
       </w:r>
       <w:r>
-        <w:t xml:space="preserve">- Upgrade/downgrade: prorrateo mensual</w:t>
+        <w:t xml:space="preserve">- Upgrade/downgrade prorrateado en el mes corriente.</w:t>
       </w:r>
     </w:p>
     <w:p>
@@ -614,9 +673,10 @@
         <w:jc w:val="start"/>
       </w:tblPr>
       <w:tblGrid>
-        <w:gridCol w:w="1980"/>
-        <w:gridCol w:w="1980"/>
-        <w:gridCol w:w="3960"/>
+        <w:gridCol w:w="1408"/>
+        <w:gridCol w:w="1408"/>
+        <w:gridCol w:w="2816"/>
+        <w:gridCol w:w="2288"/>
       </w:tblGrid>
       <w:tr>
         <w:trPr>
@@ -658,6 +718,18 @@
             </w:r>
           </w:p>
         </w:tc>
+        <w:tc>
+          <w:tcPr/>
+          <w:p>
+            <w:pPr>
+              <w:pStyle w:val="Compact"/>
+              <w:jc w:val="left"/>
+            </w:pPr>
+            <w:r>
+              <w:t xml:space="preserve">Descripción</w:t>
+            </w:r>
+          </w:p>
+        </w:tc>
       </w:tr>
       <w:tr>
         <w:tc>
@@ -700,6 +772,18 @@
             </w:r>
           </w:p>
         </w:tc>
+        <w:tc>
+          <w:tcPr/>
+          <w:p>
+            <w:pPr>
+              <w:pStyle w:val="Compact"/>
+              <w:jc w:val="left"/>
+            </w:pPr>
+            <w:r>
+              <w:t xml:space="preserve">Configuración inicial, mapeo procesos, primera auditoría</w:t>
+            </w:r>
+          </w:p>
+        </w:tc>
       </w:tr>
       <w:tr>
         <w:tc>
@@ -738,7 +822,19 @@
               <w:jc w:val="left"/>
             </w:pPr>
             <w:r>
-              <w:t xml:space="preserve">Professional / OEM</w:t>
+              <w:t xml:space="preserve">Professional / Enterprise</w:t>
+            </w:r>
+          </w:p>
+        </w:tc>
+        <w:tc>
+          <w:tcPr/>
+          <w:p>
+            <w:pPr>
+              <w:pStyle w:val="Compact"/>
+              <w:jc w:val="left"/>
+            </w:pPr>
+            <w:r>
+              <w:t xml:space="preserve">Autenticación corporativa</w:t>
             </w:r>
           </w:p>
         </w:tc>
@@ -756,19 +852,19 @@
                 <w:bCs/>
                 <w:b/>
               </w:rPr>
-              <w:t xml:space="preserve">Token Pack adicional (1M tokens)</w:t>
-            </w:r>
-          </w:p>
-        </w:tc>
-        <w:tc>
-          <w:tcPr/>
-          <w:p>
-            <w:pPr>
-              <w:pStyle w:val="Compact"/>
-              <w:jc w:val="left"/>
-            </w:pPr>
-            <w:r>
-              <w:t xml:space="preserve">120 € / mes</w:t>
+              <w:t xml:space="preserve">Pack sistemas adicionales (3 sistemas)</w:t>
+            </w:r>
+          </w:p>
+        </w:tc>
+        <w:tc>
+          <w:tcPr/>
+          <w:p>
+            <w:pPr>
+              <w:pStyle w:val="Compact"/>
+              <w:jc w:val="left"/>
+            </w:pPr>
+            <w:r>
+              <w:t xml:space="preserve">90 € / mes</w:t>
             </w:r>
           </w:p>
         </w:tc>
@@ -781,6 +877,18 @@
             </w:pPr>
             <w:r>
               <w:t xml:space="preserve">Todos</w:t>
+            </w:r>
+          </w:p>
+        </w:tc>
+        <w:tc>
+          <w:tcPr/>
+          <w:p>
+            <w:pPr>
+              <w:pStyle w:val="Compact"/>
+              <w:jc w:val="left"/>
+            </w:pPr>
+            <w:r>
+              <w:t xml:space="preserve">Amplía cobertura a más chatbots/agentes/RAG</w:t>
             </w:r>
           </w:p>
         </w:tc>
@@ -822,7 +930,19 @@
               <w:jc w:val="left"/>
             </w:pPr>
             <w:r>
-              <w:t xml:space="preserve">Professional / OEM</w:t>
+              <w:t xml:space="preserve">Professional / Enterprise</w:t>
+            </w:r>
+          </w:p>
+        </w:tc>
+        <w:tc>
+          <w:tcPr/>
+          <w:p>
+            <w:pPr>
+              <w:pStyle w:val="Compact"/>
+              <w:jc w:val="left"/>
+            </w:pPr>
+            <w:r>
+              <w:t xml:space="preserve">Workspace aislado multi-organización</w:t>
             </w:r>
           </w:p>
         </w:tc>
@@ -864,7 +984,85 @@
               <w:jc w:val="left"/>
             </w:pPr>
             <w:r>
-              <w:t xml:space="preserve">Professional / OEM</w:t>
+              <w:t xml:space="preserve">Professional / Enterprise</w:t>
+            </w:r>
+          </w:p>
+        </w:tc>
+        <w:tc>
+          <w:tcPr/>
+          <w:p>
+            <w:pPr>
+              <w:pStyle w:val="Compact"/>
+              <w:jc w:val="left"/>
+            </w:pPr>
+            <w:r>
+              <w:t xml:space="preserve">Línea dedicada incidentes críticos</w:t>
+            </w:r>
+          </w:p>
+        </w:tc>
+      </w:tr>
+      <w:tr>
+        <w:tc>
+          <w:tcPr/>
+          <w:p>
+            <w:pPr>
+              <w:pStyle w:val="Compact"/>
+              <w:jc w:val="left"/>
+            </w:pPr>
+            <w:r>
+              <w:rPr>
+                <w:bCs/>
+                <w:b/>
+              </w:rPr>
+              <w:t xml:space="preserve">Módulo servidores de inferencia</w:t>
+            </w:r>
+          </w:p>
+        </w:tc>
+        <w:tc>
+          <w:tcPr/>
+          <w:p>
+            <w:pPr>
+              <w:pStyle w:val="Compact"/>
+              <w:jc w:val="left"/>
+            </w:pPr>
+            <w:r>
+              <w:t xml:space="preserve">120 € / mes por instancia</w:t>
+            </w:r>
+          </w:p>
+        </w:tc>
+        <w:tc>
+          <w:tcPr/>
+          <w:p>
+            <w:pPr>
+              <w:pStyle w:val="Compact"/>
+              <w:jc w:val="left"/>
+            </w:pPr>
+            <w:r>
+              <w:t xml:space="preserve">Professional / Enterprise</w:t>
+            </w:r>
+          </w:p>
+        </w:tc>
+        <w:tc>
+          <w:tcPr/>
+          <w:p>
+            <w:pPr>
+              <w:pStyle w:val="Compact"/>
+              <w:jc w:val="left"/>
+            </w:pPr>
+            <w:r>
+              <w:t xml:space="preserve">Despliegue gestionado de</w:t>
+            </w:r>
+            <w:r>
+              <w:t xml:space="preserve"> </w:t>
+            </w:r>
+            <w:r>
+              <w:rPr>
+                <w:rStyle w:val="VerbatimChar"/>
+              </w:rPr>
+              <w:t xml:space="preserve">leka-llm-interpreter</w:t>
+            </w:r>
+            <w:r>
+              <w:t xml:space="preserve">, incluye modelos open-source, wrappers comerciales opcionales, routing inteligente. Costes API externos se facturan al cliente.</w:t>
             </w:r>
           </w:p>
         </w:tc>
@@ -1299,7 +1497,7 @@
                 <w:bCs/>
                 <w:b/>
               </w:rPr>
-              <w:t xml:space="preserve">12.000 €/año</w:t>
+              <w:t xml:space="preserve">12.000 €</w:t>
             </w:r>
           </w:p>
         </w:tc>
@@ -1335,7 +1533,17 @@
               <w:jc w:val="left"/>
             </w:pPr>
             <w:r>
-              <w:t xml:space="preserve">2 sistemas IA, FRIA integrada, soporte 12h, formación 1 día</w:t>
+              <w:t xml:space="preserve">2 sistemas IA, FRIA integrada, soporte 12h, formación 1 día,</w:t>
+            </w:r>
+            <w:r>
+              <w:t xml:space="preserve"> </w:t>
+            </w:r>
+            <w:r>
+              <w:rPr>
+                <w:bCs/>
+                <w:b/>
+              </w:rPr>
+              <w:t xml:space="preserve">incluye cumplimiento + gobierno + evaluación + monitorización</w:t>
             </w:r>
           </w:p>
         </w:tc>
@@ -1369,7 +1577,7 @@
                 <w:bCs/>
                 <w:b/>
               </w:rPr>
-              <w:t xml:space="preserve">24.000 €/año</w:t>
+              <w:t xml:space="preserve">24.000 €</w:t>
             </w:r>
           </w:p>
         </w:tc>
@@ -1405,7 +1613,17 @@
               <w:jc w:val="left"/>
             </w:pPr>
             <w:r>
-              <w:t xml:space="preserve">5 sistemas IA, reporting Art. 71 automatizado, soporte 8h, formación 2 días</w:t>
+              <w:t xml:space="preserve">5 sistemas IA, reporting Art. 71 automatizado, soporte 8h, formación 2 días,</w:t>
+            </w:r>
+            <w:r>
+              <w:t xml:space="preserve"> </w:t>
+            </w:r>
+            <w:r>
+              <w:rPr>
+                <w:bCs/>
+                <w:b/>
+              </w:rPr>
+              <w:t xml:space="preserve">solución integral (cumplimiento + gobierno + evaluación + monitorización)</w:t>
             </w:r>
           </w:p>
         </w:tc>
@@ -1439,7 +1657,7 @@
                 <w:bCs/>
                 <w:b/>
               </w:rPr>
-              <w:t xml:space="preserve">60.000 €/año</w:t>
+              <w:t xml:space="preserve">60.000 €</w:t>
             </w:r>
           </w:p>
         </w:tc>
@@ -1475,7 +1693,17 @@
               <w:jc w:val="left"/>
             </w:pPr>
             <w:r>
-              <w:t xml:space="preserve">10 sistemas IA, cumplimiento ENS Alto, soporte 4h, formación 3 días, auditoría anual incluida</w:t>
+              <w:t xml:space="preserve">10 sistemas IA, cumplimiento ENS Alto, soporte 4h, formación 3 días, auditoría anual incluida,</w:t>
+            </w:r>
+            <w:r>
+              <w:t xml:space="preserve"> </w:t>
+            </w:r>
+            <w:r>
+              <w:rPr>
+                <w:bCs/>
+                <w:b/>
+              </w:rPr>
+              <w:t xml:space="preserve">solución completa CodeflowX</w:t>
             </w:r>
           </w:p>
         </w:tc>

</xml_diff>

<commit_message>
docs: Especificar capacidad base OEM y packs clientes adicionales
</commit_message>
<xml_diff>
--- a/docs/comercial/PRECIOS_INTERNO_CODEFLOWX_NOV2025.docx
+++ b/docs/comercial/PRECIOS_INTERNO_CODEFLOWX_NOV2025.docx
@@ -606,7 +606,23 @@
               <w:jc w:val="left"/>
             </w:pPr>
             <w:r>
-              <w:t xml:space="preserve">Multi-tenant, marca blanca opcional, API configurables, dashboards agregados, SLA 99,5 %, soporte 4h, formación comercial, controles centralizados</w:t>
+              <w:t xml:space="preserve">Multi-tenant (hasta</w:t>
+            </w:r>
+            <w:r>
+              <w:t xml:space="preserve"> </w:t>
+            </w:r>
+            <w:r>
+              <w:rPr>
+                <w:bCs/>
+                <w:b/>
+              </w:rPr>
+              <w:t xml:space="preserve">5 clientes externos</w:t>
+            </w:r>
+            <w:r>
+              <w:t xml:space="preserve"> </w:t>
+            </w:r>
+            <w:r>
+              <w:t xml:space="preserve">incluidos), marca blanca opcional, API configurables, dashboards agregados, SLA 99,5 %, soporte 4h, formación comercial, controles centralizados</w:t>
             </w:r>
           </w:p>
         </w:tc>
@@ -1063,6 +1079,60 @@
             </w:r>
             <w:r>
               <w:t xml:space="preserve">, incluye modelos open-source, wrappers comerciales opcionales, routing inteligente. Costes API externos se facturan al cliente.</w:t>
+            </w:r>
+          </w:p>
+        </w:tc>
+      </w:tr>
+      <w:tr>
+        <w:tc>
+          <w:tcPr/>
+          <w:p>
+            <w:pPr>
+              <w:pStyle w:val="Compact"/>
+              <w:jc w:val="left"/>
+            </w:pPr>
+            <w:r>
+              <w:rPr>
+                <w:bCs/>
+                <w:b/>
+              </w:rPr>
+              <w:t xml:space="preserve">Pack clientes adicionales (5 tenants)</w:t>
+            </w:r>
+          </w:p>
+        </w:tc>
+        <w:tc>
+          <w:tcPr/>
+          <w:p>
+            <w:pPr>
+              <w:pStyle w:val="Compact"/>
+              <w:jc w:val="left"/>
+            </w:pPr>
+            <w:r>
+              <w:t xml:space="preserve">150 € / mes</w:t>
+            </w:r>
+          </w:p>
+        </w:tc>
+        <w:tc>
+          <w:tcPr/>
+          <w:p>
+            <w:pPr>
+              <w:pStyle w:val="Compact"/>
+              <w:jc w:val="left"/>
+            </w:pPr>
+            <w:r>
+              <w:t xml:space="preserve">Enterprise</w:t>
+            </w:r>
+          </w:p>
+        </w:tc>
+        <w:tc>
+          <w:tcPr/>
+          <w:p>
+            <w:pPr>
+              <w:pStyle w:val="Compact"/>
+              <w:jc w:val="left"/>
+            </w:pPr>
+            <w:r>
+              <w:t xml:space="preserve">Amplía el número de organizaciones servidas (de 5 en 5)</w:t>
             </w:r>
           </w:p>
         </w:tc>

</xml_diff>